<commit_message>
feat: refine SC 6/WG 7 agenda template sections 5, 8.3 and 9
- 5: fixed reference sentence with two [TBD] bullets
- 8.3: expected deliverable limited to TR, NP, "TR, NP" or TBD
- 9: split into 9.1 Future works and 9.2 New proposals
</commit_message>
<xml_diff>
--- a/template/template-agenda-sc6-wg7.docx
+++ b/template/template-agenda-sc6-wg7.docx
@@ -447,6 +447,54 @@
     </w:p>
     <w:p>
       <w:pPr>
+        <w:spacing w:after="80"/>
+        <w:rPr>
+          <w:rFonts w:ascii="Cambria" w:hAnsi="Cambria"/>
+          <w:color w:val="000000" w:themeColor="text1"/>
+          <w:sz w:val="24"/>
+          <w:szCs w:val="24"/>
+        </w:rPr>
+      </w:pPr>
+      <w:r>
+        <w:rPr>
+          <w:rFonts w:ascii="Cambria" w:hAnsi="Cambria"/>
+          <w:color w:val="000000" w:themeColor="text1"/>
+          <w:sz w:val="24"/>
+          <w:szCs w:val="24"/>
+        </w:rPr>
+        <w:t xml:space="preserve">Refer to the WG 7 interim meeting report and the resolutions of the previous SC 6 Plenary.</w:t>
+      </w:r>
+    </w:p>
+    <w:p>
+      <w:pPr>
+        <w:numPr>
+          <w:ilvl w:val="0"/>
+          <w:numId w:val="1"/>
+        </w:numPr>
+        <w:spacing w:after="40"/>
+        <w:rPr>
+          <w:rFonts w:ascii="Cambria" w:hAnsi="Cambria"/>
+          <w:color w:val="000000" w:themeColor="text1"/>
+          <w:sz w:val="24"/>
+          <w:szCs w:val="24"/>
+        </w:rPr>
+      </w:pPr>
+      <w:r>
+        <w:rPr>
+          <w:rFonts w:ascii="Cambria" w:hAnsi="Cambria"/>
+          <w:color w:val="000000" w:themeColor="text1"/>
+          <w:sz w:val="24"/>
+          <w:szCs w:val="24"/>
+        </w:rPr>
+        <w:t xml:space="preserve">[TBD]</w:t>
+      </w:r>
+    </w:p>
+    <w:p>
+      <w:pPr>
+        <w:numPr>
+          <w:ilvl w:val="0"/>
+          <w:numId w:val="1"/>
+        </w:numPr>
         <w:spacing w:after="140"/>
         <w:rPr>
           <w:rFonts w:ascii="Cambria" w:hAnsi="Cambria"/>
@@ -462,153 +510,7 @@
           <w:sz w:val="24"/>
           <w:szCs w:val="24"/>
         </w:rPr>
-        <w:t>{{</w:t>
-      </w:r>
-      <w:proofErr w:type="spellStart"/>
-      <w:r>
-        <w:rPr>
-          <w:rFonts w:ascii="Cambria" w:hAnsi="Cambria"/>
-          <w:color w:val="000000" w:themeColor="text1"/>
-          <w:sz w:val="24"/>
-          <w:szCs w:val="24"/>
-        </w:rPr>
-        <w:t>previous_meeting_review</w:t>
-      </w:r>
-      <w:proofErr w:type="spellEnd"/>
-      <w:r>
-        <w:rPr>
-          <w:rFonts w:ascii="Cambria" w:hAnsi="Cambria"/>
-          <w:color w:val="000000" w:themeColor="text1"/>
-          <w:sz w:val="24"/>
-          <w:szCs w:val="24"/>
-        </w:rPr>
-        <w:t>:</w:t>
-      </w:r>
-      <w:r>
-        <w:rPr>
-          <w:rFonts w:ascii="Cambria" w:hAnsi="Cambria"/>
-          <w:color w:val="000000" w:themeColor="text1"/>
-          <w:sz w:val="24"/>
-          <w:szCs w:val="24"/>
-        </w:rPr>
-        <w:t>전회</w:t>
-      </w:r>
-      <w:r>
-        <w:rPr>
-          <w:rFonts w:ascii="Cambria" w:hAnsi="Cambria"/>
-          <w:color w:val="000000" w:themeColor="text1"/>
-          <w:sz w:val="24"/>
-          <w:szCs w:val="24"/>
-        </w:rPr>
-        <w:t xml:space="preserve"> </w:t>
-      </w:r>
-      <w:r>
-        <w:rPr>
-          <w:rFonts w:ascii="Cambria" w:hAnsi="Cambria"/>
-          <w:color w:val="000000" w:themeColor="text1"/>
-          <w:sz w:val="24"/>
-          <w:szCs w:val="24"/>
-        </w:rPr>
-        <w:t>회의</w:t>
-      </w:r>
-      <w:r>
-        <w:rPr>
-          <w:rFonts w:ascii="Cambria" w:hAnsi="Cambria"/>
-          <w:color w:val="000000" w:themeColor="text1"/>
-          <w:sz w:val="24"/>
-          <w:szCs w:val="24"/>
-        </w:rPr>
-        <w:t xml:space="preserve"> </w:t>
-      </w:r>
-      <w:r>
-        <w:rPr>
-          <w:rFonts w:ascii="Cambria" w:hAnsi="Cambria"/>
-          <w:color w:val="000000" w:themeColor="text1"/>
-          <w:sz w:val="24"/>
-          <w:szCs w:val="24"/>
-        </w:rPr>
-        <w:t>결과</w:t>
-      </w:r>
-      <w:r>
-        <w:rPr>
-          <w:rFonts w:ascii="Cambria" w:hAnsi="Cambria"/>
-          <w:color w:val="000000" w:themeColor="text1"/>
-          <w:sz w:val="24"/>
-          <w:szCs w:val="24"/>
-        </w:rPr>
-        <w:t xml:space="preserve"> </w:t>
-      </w:r>
-      <w:r>
-        <w:rPr>
-          <w:rFonts w:ascii="Cambria" w:hAnsi="Cambria"/>
-          <w:color w:val="000000" w:themeColor="text1"/>
-          <w:sz w:val="24"/>
-          <w:szCs w:val="24"/>
-        </w:rPr>
-        <w:t>문서</w:t>
-      </w:r>
-      <w:r>
-        <w:rPr>
-          <w:rFonts w:ascii="Cambria" w:hAnsi="Cambria"/>
-          <w:color w:val="000000" w:themeColor="text1"/>
-          <w:sz w:val="24"/>
-          <w:szCs w:val="24"/>
-        </w:rPr>
-        <w:t xml:space="preserve"> </w:t>
-      </w:r>
-      <w:r>
-        <w:rPr>
-          <w:rFonts w:ascii="Cambria" w:hAnsi="Cambria"/>
-          <w:color w:val="000000" w:themeColor="text1"/>
-          <w:sz w:val="24"/>
-          <w:szCs w:val="24"/>
-        </w:rPr>
-        <w:t>번호와</w:t>
-      </w:r>
-      <w:r>
-        <w:rPr>
-          <w:rFonts w:ascii="Cambria" w:hAnsi="Cambria"/>
-          <w:color w:val="000000" w:themeColor="text1"/>
-          <w:sz w:val="24"/>
-          <w:szCs w:val="24"/>
-        </w:rPr>
-        <w:t xml:space="preserve"> </w:t>
-      </w:r>
-      <w:r>
-        <w:rPr>
-          <w:rFonts w:ascii="Cambria" w:hAnsi="Cambria"/>
-          <w:color w:val="000000" w:themeColor="text1"/>
-          <w:sz w:val="24"/>
-          <w:szCs w:val="24"/>
-        </w:rPr>
-        <w:t>요약</w:t>
-      </w:r>
-      <w:r>
-        <w:rPr>
-          <w:rFonts w:ascii="Cambria" w:hAnsi="Cambria"/>
-          <w:color w:val="000000" w:themeColor="text1"/>
-          <w:sz w:val="24"/>
-          <w:szCs w:val="24"/>
-        </w:rPr>
-        <w:t xml:space="preserve">. </w:t>
-      </w:r>
-      <w:r>
-        <w:rPr>
-          <w:rFonts w:ascii="Cambria" w:hAnsi="Cambria"/>
-          <w:color w:val="000000" w:themeColor="text1"/>
-          <w:sz w:val="24"/>
-          <w:szCs w:val="24"/>
-        </w:rPr>
-        <w:t>없으면</w:t>
-      </w:r>
-      <w:r>
-        <w:rPr>
-          <w:rFonts w:ascii="Cambria" w:hAnsi="Cambria"/>
-          <w:color w:val="000000" w:themeColor="text1"/>
-          <w:sz w:val="24"/>
-          <w:szCs w:val="24"/>
-        </w:rPr>
-        <w:t xml:space="preserve"> TBD}}</w:t>
+        <w:t xml:space="preserve">[TBD]</w:t>
       </w:r>
     </w:p>
     <w:p>
@@ -4812,45 +4714,7 @@
                 <w:sz w:val="20"/>
                 <w:szCs w:val="20"/>
               </w:rPr>
-              <w:t>{{</w:t>
-            </w:r>
-            <w:proofErr w:type="spellStart"/>
-            <w:r>
-              <w:rPr>
-                <w:rFonts w:ascii="Cambria" w:hAnsi="Cambria"/>
-                <w:color w:val="000000" w:themeColor="text1"/>
-                <w:sz w:val="20"/>
-                <w:szCs w:val="20"/>
-              </w:rPr>
-              <w:t>projects.deliverable:IS</w:t>
-            </w:r>
-            <w:proofErr w:type="spellEnd"/>
-            <w:r>
-              <w:rPr>
-                <w:rFonts w:ascii="Cambria" w:hAnsi="Cambria"/>
-                <w:color w:val="000000" w:themeColor="text1"/>
-                <w:sz w:val="20"/>
-                <w:szCs w:val="20"/>
-              </w:rPr>
-              <w:t xml:space="preserve">, TR, TS </w:t>
-            </w:r>
-            <w:r>
-              <w:rPr>
-                <w:rFonts w:ascii="Cambria" w:hAnsi="Cambria"/>
-                <w:color w:val="000000" w:themeColor="text1"/>
-                <w:sz w:val="20"/>
-                <w:szCs w:val="20"/>
-              </w:rPr>
-              <w:t>등</w:t>
-            </w:r>
-            <w:r>
-              <w:rPr>
-                <w:rFonts w:ascii="Cambria" w:hAnsi="Cambria"/>
-                <w:color w:val="000000" w:themeColor="text1"/>
-                <w:sz w:val="20"/>
-                <w:szCs w:val="20"/>
-              </w:rPr>
-              <w:t>}}</w:t>
+              <w:t>{{projects.deliverable:TR, NP, TR, NP 둘 다(TR, NP), TBD 중 하나. TBD는 단독으로만 사용}}</w:t>
             </w:r>
           </w:p>
         </w:tc>
@@ -5635,6 +5499,64 @@
           <w:color w:val="000000" w:themeColor="text1"/>
         </w:rPr>
         <w:t>9. Future work and new proposals</w:t>
+      </w:r>
+    </w:p>
+    <w:p>
+      <w:pPr>
+        <w:pStyle w:val="2"/>
+        <w:spacing w:before="260" w:after="120"/>
+        <w:rPr>
+          <w:rFonts w:ascii="Cambria" w:hAnsi="Cambria"/>
+          <w:color w:val="000000" w:themeColor="text1"/>
+        </w:rPr>
+      </w:pPr>
+      <w:r>
+        <w:rPr>
+          <w:rFonts w:ascii="Cambria" w:hAnsi="Cambria"/>
+          <w:b/>
+          <w:bCs/>
+          <w:color w:val="000000" w:themeColor="text1"/>
+        </w:rPr>
+        <w:t>9.1 Future works</w:t>
+      </w:r>
+    </w:p>
+    <w:p>
+      <w:pPr>
+        <w:spacing w:after="140"/>
+        <w:rPr>
+          <w:rFonts w:ascii="Cambria" w:hAnsi="Cambria"/>
+          <w:color w:val="000000" w:themeColor="text1"/>
+          <w:sz w:val="24"/>
+          <w:szCs w:val="24"/>
+        </w:rPr>
+      </w:pPr>
+      <w:r>
+        <w:rPr>
+          <w:rFonts w:ascii="Cambria" w:hAnsi="Cambria"/>
+          <w:color w:val="000000" w:themeColor="text1"/>
+          <w:sz w:val="24"/>
+          <w:szCs w:val="24"/>
+        </w:rPr>
+        <w:t xml:space="preserve">{{future_works:향후 작업 계획. 없으면 TBD}}</w:t>
+      </w:r>
+    </w:p>
+    <w:p>
+      <w:pPr>
+        <w:pStyle w:val="2"/>
+        <w:spacing w:before="260" w:after="120"/>
+        <w:rPr>
+          <w:rFonts w:ascii="Cambria" w:hAnsi="Cambria"/>
+          <w:color w:val="000000" w:themeColor="text1"/>
+        </w:rPr>
+      </w:pPr>
+      <w:r>
+        <w:rPr>
+          <w:rFonts w:ascii="Cambria" w:hAnsi="Cambria"/>
+          <w:b/>
+          <w:bCs/>
+          <w:color w:val="000000" w:themeColor="text1"/>
+        </w:rPr>
+        <w:t>9.2 New proposals</w:t>
       </w:r>
     </w:p>
     <w:p>

</xml_diff>